<commit_message>
Created 15_05_2026 this folder and added require code in it and crated Hands_On_Practical_Steps this word file, updated steps in it and also updated README.md file in same folder.
</commit_message>
<xml_diff>
--- a/14_05_2026/Hands_On_Practical_Steps.docx
+++ b/14_05_2026/Hands_On_Practical_Steps.docx
@@ -465,6 +465,9 @@
     </w:p>
     <w:p>
       <w:r>
+        <w:rPr>
+          <w:noProof/>
+        </w:rPr>
         <w:drawing>
           <wp:inline distT="0" distB="0" distL="0" distR="0" wp14:anchorId="73F3D0CE" wp14:editId="6B9E673E">
             <wp:extent cx="3130711" cy="3568883"/>
@@ -640,13 +643,8 @@
         <w:t xml:space="preserve">        "</w:t>
       </w:r>
       <w:proofErr w:type="spellStart"/>
-      <w:proofErr w:type="gramStart"/>
-      <w:r>
-        <w:t>sts</w:t>
-      </w:r>
-      <w:proofErr w:type="gramEnd"/>
-      <w:r>
-        <w:t>:AssumeRole</w:t>
+      <w:r>
+        <w:t>sts:AssumeRole</w:t>
       </w:r>
       <w:proofErr w:type="spellEnd"/>
       <w:r>
@@ -658,13 +656,8 @@
         <w:t xml:space="preserve">        "</w:t>
       </w:r>
       <w:proofErr w:type="spellStart"/>
-      <w:proofErr w:type="gramStart"/>
-      <w:r>
-        <w:t>sts</w:t>
-      </w:r>
-      <w:proofErr w:type="gramEnd"/>
-      <w:r>
-        <w:t>:TagSession</w:t>
+      <w:r>
+        <w:t>sts:TagSession</w:t>
       </w:r>
       <w:proofErr w:type="spellEnd"/>
       <w:r>
@@ -740,6 +733,9 @@
     </w:p>
     <w:p>
       <w:r>
+        <w:rPr>
+          <w:noProof/>
+        </w:rPr>
         <w:drawing>
           <wp:inline distT="0" distB="0" distL="0" distR="0" wp14:anchorId="6D55C298" wp14:editId="7F395E19">
             <wp:extent cx="5731510" cy="2703830"/>
@@ -831,18 +827,13 @@
       </w:r>
       <w:proofErr w:type="spellStart"/>
       <w:r>
-        <w:t>arn:aws:</w:t>
-      </w:r>
-      <w:proofErr w:type="gramStart"/>
-      <w:r>
-        <w:t>iam</w:t>
+        <w:t>arn:aws:iam</w:t>
       </w:r>
       <w:proofErr w:type="spellEnd"/>
       <w:r>
         <w:t>::</w:t>
       </w:r>
       <w:proofErr w:type="spellStart"/>
-      <w:proofErr w:type="gramEnd"/>
       <w:r>
         <w:t>aws:policy</w:t>
       </w:r>
@@ -858,6 +849,9 @@
     </w:p>
     <w:p>
       <w:r>
+        <w:rPr>
+          <w:noProof/>
+        </w:rPr>
         <w:drawing>
           <wp:inline distT="0" distB="0" distL="0" distR="0" wp14:anchorId="1C64CF41" wp14:editId="43680163">
             <wp:extent cx="5731510" cy="530860"/>
@@ -953,6 +947,9 @@
     </w:p>
     <w:p>
       <w:r>
+        <w:rPr>
+          <w:noProof/>
+        </w:rPr>
         <w:drawing>
           <wp:inline distT="0" distB="0" distL="0" distR="0" wp14:anchorId="324C7D64" wp14:editId="006519F0">
             <wp:extent cx="5731510" cy="1149350"/>
@@ -1075,19 +1072,14 @@
       </w:r>
       <w:proofErr w:type="spellEnd"/>
       <w:r>
-        <w:t xml:space="preserve"> arn:aws:</w:t>
-      </w:r>
-      <w:proofErr w:type="gramStart"/>
-      <w:r>
-        <w:t>iam::</w:t>
-      </w:r>
-      <w:proofErr w:type="gramEnd"/>
-      <w:r>
-        <w:t>${AWS_ACCOUNT_ID}:role/AmazonEKS_EBS_CSI_DriverRole_${EKS_CLUSTER_NAME}</w:t>
-      </w:r>
-    </w:p>
-    <w:p>
-      <w:r>
+        <w:t xml:space="preserve"> arn:aws:iam::${AWS_ACCOUNT_ID}:role/AmazonEKS_EBS_CSI_DriverRole_${EKS_CLUSTER_NAME}</w:t>
+      </w:r>
+    </w:p>
+    <w:p>
+      <w:r>
+        <w:rPr>
+          <w:noProof/>
+        </w:rPr>
         <w:lastRenderedPageBreak/>
         <w:drawing>
           <wp:inline distT="0" distB="0" distL="0" distR="0" wp14:anchorId="78235A4D" wp14:editId="75063B90">
@@ -1145,6 +1137,9 @@
     </w:p>
     <w:p>
       <w:r>
+        <w:rPr>
+          <w:noProof/>
+        </w:rPr>
         <w:drawing>
           <wp:inline distT="0" distB="0" distL="0" distR="0" wp14:anchorId="3ADE7D27" wp14:editId="433A3EE4">
             <wp:extent cx="5731510" cy="2122805"/>
@@ -1214,6 +1209,9 @@
     </w:p>
     <w:p>
       <w:r>
+        <w:rPr>
+          <w:noProof/>
+        </w:rPr>
         <w:drawing>
           <wp:inline distT="0" distB="0" distL="0" distR="0" wp14:anchorId="05CD9822" wp14:editId="78C664C8">
             <wp:extent cx="5731510" cy="1176020"/>
@@ -1320,20 +1318,15 @@
       </w:r>
       <w:proofErr w:type="spellEnd"/>
       <w:r>
-        <w:t xml:space="preserve"> arn:aws:</w:t>
-      </w:r>
-      <w:proofErr w:type="gramStart"/>
-      <w:r>
-        <w:t>iam::</w:t>
-      </w:r>
-      <w:proofErr w:type="gramEnd"/>
-      <w:r>
-        <w:t>${AWS_ACCOUNT_ID}:role/AmazonEKS_EBS_CSI_DriverRole_${EKS_CLUSTER_NAME}</w:t>
+        <w:t xml:space="preserve"> arn:aws:iam::${AWS_ACCOUNT_ID}:role/AmazonEKS_EBS_CSI_DriverRole_${EKS_CLUSTER_NAME}</w:t>
       </w:r>
     </w:p>
     <w:p/>
     <w:p>
       <w:r>
+        <w:rPr>
+          <w:noProof/>
+        </w:rPr>
         <w:drawing>
           <wp:inline distT="0" distB="0" distL="0" distR="0" wp14:anchorId="6C95DC08" wp14:editId="7987CC53">
             <wp:extent cx="5731510" cy="2661920"/>
@@ -1396,6 +1389,9 @@
     </w:p>
     <w:p>
       <w:r>
+        <w:rPr>
+          <w:noProof/>
+        </w:rPr>
         <w:drawing>
           <wp:inline distT="0" distB="0" distL="0" distR="0" wp14:anchorId="16DE4D9D" wp14:editId="4B989045">
             <wp:extent cx="5731510" cy="1420495"/>
@@ -1505,6 +1501,9 @@
     </w:p>
     <w:p>
       <w:r>
+        <w:rPr>
+          <w:noProof/>
+        </w:rPr>
         <w:drawing>
           <wp:inline distT="0" distB="0" distL="0" distR="0" wp14:anchorId="08A6974E" wp14:editId="5CDACB64">
             <wp:extent cx="5731510" cy="976630"/>
@@ -1568,6 +1567,9 @@
     </w:p>
     <w:p>
       <w:r>
+        <w:rPr>
+          <w:noProof/>
+        </w:rPr>
         <w:drawing>
           <wp:inline distT="0" distB="0" distL="0" distR="0" wp14:anchorId="41A34662" wp14:editId="266B2174">
             <wp:extent cx="5731510" cy="675640"/>
@@ -1630,6 +1632,9 @@
     </w:p>
     <w:p>
       <w:r>
+        <w:rPr>
+          <w:noProof/>
+        </w:rPr>
         <w:drawing>
           <wp:inline distT="0" distB="0" distL="0" distR="0" wp14:anchorId="24B524B2" wp14:editId="2B337D69">
             <wp:extent cx="5731510" cy="557530"/>
@@ -1692,6 +1697,9 @@
     </w:p>
     <w:p>
       <w:r>
+        <w:rPr>
+          <w:noProof/>
+        </w:rPr>
         <w:drawing>
           <wp:inline distT="0" distB="0" distL="0" distR="0" wp14:anchorId="4F6F53E3" wp14:editId="4E1043BD">
             <wp:extent cx="5731510" cy="273050"/>
@@ -1741,6 +1749,9 @@
     </w:p>
     <w:p>
       <w:r>
+        <w:rPr>
+          <w:noProof/>
+        </w:rPr>
         <w:drawing>
           <wp:inline distT="0" distB="0" distL="0" distR="0" wp14:anchorId="0247D4F5" wp14:editId="6A73D6A5">
             <wp:extent cx="5731510" cy="494030"/>
@@ -1790,13 +1801,7 @@
         <w:t xml:space="preserve"> Getting error after running above command,  </w:t>
       </w:r>
       <w:r>
-        <w:t xml:space="preserve">run below commands </w:t>
-      </w:r>
-      <w:r>
-        <w:t>to resolve this issue</w:t>
-      </w:r>
-      <w:r>
-        <w:t>.</w:t>
+        <w:t>run below commands to resolve this issue.</w:t>
       </w:r>
     </w:p>
     <w:p>
@@ -1824,6 +1829,9 @@
     </w:p>
     <w:p>
       <w:r>
+        <w:rPr>
+          <w:noProof/>
+        </w:rPr>
         <w:drawing>
           <wp:inline distT="0" distB="0" distL="0" distR="0" wp14:anchorId="674B72AE" wp14:editId="547B58C6">
             <wp:extent cx="4648439" cy="254013"/>
@@ -1868,6 +1876,9 @@
     </w:p>
     <w:p>
       <w:r>
+        <w:rPr>
+          <w:noProof/>
+        </w:rPr>
         <w:drawing>
           <wp:inline distT="0" distB="0" distL="0" distR="0" wp14:anchorId="18AB32B8" wp14:editId="3A0CAC07">
             <wp:extent cx="5731510" cy="550545"/>
@@ -1907,7 +1918,7 @@
     </w:p>
     <w:p>
       <w:r>
-        <w:t xml:space="preserve">helm install </w:t>
+        <w:t xml:space="preserve">helm upgrade --install </w:t>
       </w:r>
       <w:proofErr w:type="spellStart"/>
       <w:r>
@@ -1941,7 +1952,7 @@
     </w:p>
     <w:p>
       <w:r>
-        <w:t xml:space="preserve">  -n </w:t>
+        <w:t xml:space="preserve">  --namespace </w:t>
       </w:r>
       <w:proofErr w:type="spellStart"/>
       <w:r>
@@ -1949,11 +1960,39 @@
       </w:r>
       <w:proofErr w:type="spellEnd"/>
       <w:r>
-        <w:t>-system</w:t>
-      </w:r>
-    </w:p>
-    <w:p>
-      <w:r>
+        <w:t>-system \</w:t>
+      </w:r>
+    </w:p>
+    <w:p>
+      <w:pPr>
+        <w:rPr>
+          <w:noProof/>
+        </w:rPr>
+      </w:pPr>
+      <w:r>
+        <w:t xml:space="preserve">  --set </w:t>
+      </w:r>
+      <w:proofErr w:type="spellStart"/>
+      <w:r>
+        <w:t>tokenRequests</w:t>
+      </w:r>
+      <w:proofErr w:type="spellEnd"/>
+      <w:r>
+        <w:t>[0].audience="pods.eks.amazonaws.com"</w:t>
+      </w:r>
+      <w:r>
+        <w:rPr>
+          <w:noProof/>
+        </w:rPr>
+        <w:t xml:space="preserve"> </w:t>
+      </w:r>
+    </w:p>
+    <w:p>
+      <w:r>
+        <w:rPr>
+          <w:noProof/>
+        </w:rPr>
+        <w:lastRenderedPageBreak/>
         <w:drawing>
           <wp:inline distT="0" distB="0" distL="0" distR="0" wp14:anchorId="4BF34A8C" wp14:editId="3EC922DF">
             <wp:extent cx="5731510" cy="1870710"/>
@@ -1994,7 +2033,6 @@
     <w:p>
       <w:proofErr w:type="spellStart"/>
       <w:r>
-        <w:lastRenderedPageBreak/>
         <w:t>kubectl</w:t>
       </w:r>
       <w:proofErr w:type="spellEnd"/>
@@ -2017,6 +2055,9 @@
     </w:p>
     <w:p>
       <w:r>
+        <w:rPr>
+          <w:noProof/>
+        </w:rPr>
         <w:drawing>
           <wp:inline distT="0" distB="0" distL="0" distR="0" wp14:anchorId="55D444C7" wp14:editId="0396FED0">
             <wp:extent cx="5731510" cy="393700"/>
@@ -2078,6 +2119,9 @@
     </w:p>
     <w:p>
       <w:r>
+        <w:rPr>
+          <w:noProof/>
+        </w:rPr>
         <w:drawing>
           <wp:inline distT="0" distB="0" distL="0" distR="0" wp14:anchorId="28C8AC2A" wp14:editId="0FFB99D4">
             <wp:extent cx="5731510" cy="373380"/>
@@ -2127,6 +2171,9 @@
     </w:p>
     <w:p>
       <w:r>
+        <w:rPr>
+          <w:noProof/>
+        </w:rPr>
         <w:drawing>
           <wp:inline distT="0" distB="0" distL="0" distR="0" wp14:anchorId="7C1D56BF" wp14:editId="72D5477F">
             <wp:extent cx="5731510" cy="1282065"/>
@@ -2181,6 +2228,9 @@
     </w:p>
     <w:p>
       <w:r>
+        <w:rPr>
+          <w:noProof/>
+        </w:rPr>
         <w:drawing>
           <wp:inline distT="0" distB="0" distL="0" distR="0" wp14:anchorId="3CAD9616" wp14:editId="0A172B21">
             <wp:extent cx="5731510" cy="460375"/>
@@ -2235,6 +2285,9 @@
     </w:p>
     <w:p>
       <w:r>
+        <w:rPr>
+          <w:noProof/>
+        </w:rPr>
         <w:drawing>
           <wp:inline distT="0" distB="0" distL="0" distR="0" wp14:anchorId="7474210B" wp14:editId="5471D9B0">
             <wp:extent cx="5731510" cy="1005840"/>
@@ -2287,6 +2340,10 @@
     </w:p>
     <w:p>
       <w:r>
+        <w:rPr>
+          <w:noProof/>
+        </w:rPr>
+        <w:lastRenderedPageBreak/>
         <w:drawing>
           <wp:inline distT="0" distB="0" distL="0" distR="0" wp14:anchorId="47C55BCF" wp14:editId="468F110A">
             <wp:extent cx="5731510" cy="557530"/>
@@ -2471,7 +2528,6 @@
         <w:t xml:space="preserve"> this command after that Pod creation issue has been resolved.</w:t>
       </w:r>
     </w:p>
-    <w:p/>
     <w:p>
       <w:pPr>
         <w:rPr>
@@ -2483,7 +2539,6 @@
     <w:p>
       <w:proofErr w:type="spellStart"/>
       <w:r>
-        <w:lastRenderedPageBreak/>
         <w:t>kubectl</w:t>
       </w:r>
       <w:proofErr w:type="spellEnd"/>
@@ -2501,6 +2556,9 @@
     </w:p>
     <w:p>
       <w:r>
+        <w:rPr>
+          <w:noProof/>
+        </w:rPr>
         <w:drawing>
           <wp:inline distT="0" distB="0" distL="0" distR="0" wp14:anchorId="79E21978" wp14:editId="631E464F">
             <wp:extent cx="5731510" cy="579755"/>
@@ -2547,15 +2605,7 @@
         <w:t>endpoints</w:t>
       </w:r>
       <w:r>
-        <w:t xml:space="preserve">, from my system browser, I </w:t>
-      </w:r>
-      <w:proofErr w:type="gramStart"/>
-      <w:r>
-        <w:t>can</w:t>
-      </w:r>
-      <w:proofErr w:type="gramEnd"/>
-      <w:r>
-        <w:t xml:space="preserve"> able to access those </w:t>
+        <w:t xml:space="preserve">, from my system browser, I can able to access those </w:t>
       </w:r>
       <w:r>
         <w:t>endpoints</w:t>
@@ -2577,6 +2627,9 @@
     <w:p/>
     <w:p>
       <w:r>
+        <w:rPr>
+          <w:noProof/>
+        </w:rPr>
         <w:drawing>
           <wp:inline distT="0" distB="0" distL="0" distR="0" wp14:anchorId="753A8081" wp14:editId="25FC91A9">
             <wp:extent cx="5731510" cy="995045"/>
@@ -2617,6 +2670,10 @@
     <w:p/>
     <w:p>
       <w:r>
+        <w:rPr>
+          <w:noProof/>
+        </w:rPr>
+        <w:lastRenderedPageBreak/>
         <w:drawing>
           <wp:inline distT="0" distB="0" distL="0" distR="0" wp14:anchorId="61DAC468" wp14:editId="7BB40E59">
             <wp:extent cx="5731510" cy="3215640"/>
@@ -2685,7 +2742,6 @@
     </w:p>
     <w:p>
       <w:r>
-        <w:lastRenderedPageBreak/>
         <w:t xml:space="preserve">  -- </w:t>
       </w:r>
       <w:proofErr w:type="spellStart"/>
@@ -2729,6 +2785,9 @@
     <w:p/>
     <w:p>
       <w:r>
+        <w:rPr>
+          <w:noProof/>
+        </w:rPr>
         <w:drawing>
           <wp:inline distT="0" distB="0" distL="0" distR="0" wp14:anchorId="2FC845D8" wp14:editId="3542D34C">
             <wp:extent cx="5731510" cy="1941195"/>
@@ -2769,6 +2828,10 @@
     <w:p/>
     <w:p>
       <w:r>
+        <w:rPr>
+          <w:noProof/>
+        </w:rPr>
+        <w:lastRenderedPageBreak/>
         <w:drawing>
           <wp:inline distT="0" distB="0" distL="0" distR="0" wp14:anchorId="6214B211" wp14:editId="42F0181E">
             <wp:extent cx="5731510" cy="2853690"/>
@@ -2826,6 +2889,9 @@
     </w:p>
     <w:p>
       <w:r>
+        <w:rPr>
+          <w:noProof/>
+        </w:rPr>
         <w:drawing>
           <wp:inline distT="0" distB="0" distL="0" distR="0" wp14:anchorId="203E923D" wp14:editId="39C6D974">
             <wp:extent cx="5731510" cy="439420"/>
@@ -2875,6 +2941,9 @@
     </w:p>
     <w:p>
       <w:r>
+        <w:rPr>
+          <w:noProof/>
+        </w:rPr>
         <w:drawing>
           <wp:inline distT="0" distB="0" distL="0" distR="0" wp14:anchorId="6CB36CD2" wp14:editId="62728FFA">
             <wp:extent cx="5731510" cy="732155"/>
@@ -2937,6 +3006,9 @@
     </w:p>
     <w:p>
       <w:r>
+        <w:rPr>
+          <w:noProof/>
+        </w:rPr>
         <w:drawing>
           <wp:inline distT="0" distB="0" distL="0" distR="0" wp14:anchorId="04D0BD37" wp14:editId="447097AA">
             <wp:extent cx="5731510" cy="1165225"/>
@@ -2986,6 +3058,9 @@
     </w:p>
     <w:p>
       <w:r>
+        <w:rPr>
+          <w:noProof/>
+        </w:rPr>
         <w:drawing>
           <wp:inline distT="0" distB="0" distL="0" distR="0" wp14:anchorId="262113BE" wp14:editId="58D58AF9">
             <wp:extent cx="5731510" cy="283210"/>
@@ -3052,6 +3127,10 @@
     </w:p>
     <w:p>
       <w:r>
+        <w:rPr>
+          <w:noProof/>
+        </w:rPr>
+        <w:lastRenderedPageBreak/>
         <w:drawing>
           <wp:inline distT="0" distB="0" distL="0" distR="0" wp14:anchorId="71E92D4C" wp14:editId="32F4EC90">
             <wp:extent cx="5731510" cy="570230"/>
@@ -3106,6 +3185,9 @@
     </w:p>
     <w:p>
       <w:r>
+        <w:rPr>
+          <w:noProof/>
+        </w:rPr>
         <w:drawing>
           <wp:inline distT="0" distB="0" distL="0" distR="0" wp14:anchorId="76798700" wp14:editId="1DB3E3F8">
             <wp:extent cx="5731510" cy="602615"/>
@@ -3175,6 +3257,9 @@
     </w:p>
     <w:p>
       <w:r>
+        <w:rPr>
+          <w:noProof/>
+        </w:rPr>
         <w:drawing>
           <wp:inline distT="0" distB="0" distL="0" distR="0" wp14:anchorId="17B5FE74" wp14:editId="4FD5B06F">
             <wp:extent cx="5731510" cy="334645"/>
@@ -3222,7 +3307,6 @@
     <w:p>
       <w:proofErr w:type="spellStart"/>
       <w:r>
-        <w:lastRenderedPageBreak/>
         <w:t>aws</w:t>
       </w:r>
       <w:proofErr w:type="spellEnd"/>
@@ -3263,6 +3347,9 @@
     </w:p>
     <w:p>
       <w:r>
+        <w:rPr>
+          <w:noProof/>
+        </w:rPr>
         <w:drawing>
           <wp:inline distT="0" distB="0" distL="0" distR="0" wp14:anchorId="43A68970" wp14:editId="049731DF">
             <wp:extent cx="5731510" cy="1302385"/>
@@ -3323,6 +3410,10 @@
     </w:p>
     <w:p>
       <w:r>
+        <w:rPr>
+          <w:noProof/>
+        </w:rPr>
+        <w:lastRenderedPageBreak/>
         <w:drawing>
           <wp:inline distT="0" distB="0" distL="0" distR="0" wp14:anchorId="5D5A1078" wp14:editId="1006DB06">
             <wp:extent cx="5731510" cy="3021330"/>
@@ -3362,13 +3453,7 @@
     </w:p>
     <w:p>
       <w:r>
-        <w:t xml:space="preserve"># Created </w:t>
-      </w:r>
-      <w:r>
-        <w:t>Subnet Group</w:t>
-      </w:r>
-      <w:r>
-        <w:t xml:space="preserve"> for </w:t>
+        <w:t xml:space="preserve"># Created Subnet Group for </w:t>
       </w:r>
       <w:proofErr w:type="spellStart"/>
       <w:r>
@@ -3381,6 +3466,9 @@
     </w:p>
     <w:p>
       <w:r>
+        <w:rPr>
+          <w:noProof/>
+        </w:rPr>
         <w:drawing>
           <wp:inline distT="0" distB="0" distL="0" distR="0" wp14:anchorId="3FDE1DB3" wp14:editId="583CA369">
             <wp:extent cx="5731510" cy="1430020"/>
@@ -3421,7 +3509,6 @@
     <w:p/>
     <w:p>
       <w:r>
-        <w:lastRenderedPageBreak/>
         <w:t xml:space="preserve"># Created </w:t>
       </w:r>
       <w:proofErr w:type="spellStart"/>
@@ -3435,6 +3522,9 @@
     </w:p>
     <w:p>
       <w:r>
+        <w:rPr>
+          <w:noProof/>
+        </w:rPr>
         <w:drawing>
           <wp:inline distT="0" distB="0" distL="0" distR="0" wp14:anchorId="4D7DF36C" wp14:editId="665288B3">
             <wp:extent cx="5731510" cy="1788795"/>
@@ -3475,6 +3565,10 @@
     <w:p/>
     <w:p>
       <w:r>
+        <w:rPr>
+          <w:noProof/>
+        </w:rPr>
+        <w:lastRenderedPageBreak/>
         <w:drawing>
           <wp:inline distT="0" distB="0" distL="0" distR="0" wp14:anchorId="3977427E" wp14:editId="38A9AA30">
             <wp:extent cx="5731510" cy="2853055"/>
@@ -3568,7 +3662,9 @@
     </w:p>
     <w:p>
       <w:r>
-        <w:lastRenderedPageBreak/>
+        <w:rPr>
+          <w:noProof/>
+        </w:rPr>
         <w:drawing>
           <wp:inline distT="0" distB="0" distL="0" distR="0" wp14:anchorId="6E24A6F3" wp14:editId="22F49E96">
             <wp:extent cx="5731510" cy="2045970"/>
@@ -3613,6 +3709,9 @@
     </w:p>
     <w:p>
       <w:r>
+        <w:rPr>
+          <w:noProof/>
+        </w:rPr>
         <w:drawing>
           <wp:inline distT="0" distB="0" distL="0" distR="0" wp14:anchorId="5F2614AB" wp14:editId="6F6D2F04">
             <wp:extent cx="5731510" cy="1762125"/>
@@ -3652,6 +3751,7 @@
     </w:p>
     <w:p>
       <w:r>
+        <w:lastRenderedPageBreak/>
         <w:t>SHOW DATABASES;</w:t>
       </w:r>
     </w:p>
@@ -3662,6 +3762,9 @@
     </w:p>
     <w:p>
       <w:r>
+        <w:rPr>
+          <w:noProof/>
+        </w:rPr>
         <w:drawing>
           <wp:inline distT="0" distB="0" distL="0" distR="0" wp14:anchorId="6755DD5F" wp14:editId="1B30B3D0">
             <wp:extent cx="5731510" cy="2933700"/>
@@ -3701,7 +3804,9 @@
     </w:p>
     <w:p>
       <w:r>
-        <w:lastRenderedPageBreak/>
+        <w:rPr>
+          <w:noProof/>
+        </w:rPr>
         <w:drawing>
           <wp:inline distT="0" distB="0" distL="0" distR="0" wp14:anchorId="7D43D71A" wp14:editId="7D001CCC">
             <wp:extent cx="5731510" cy="781685"/>
@@ -3751,6 +3856,9 @@
     </w:p>
     <w:p>
       <w:r>
+        <w:rPr>
+          <w:noProof/>
+        </w:rPr>
         <w:drawing>
           <wp:inline distT="0" distB="0" distL="0" distR="0" wp14:anchorId="661297C9" wp14:editId="45B05D43">
             <wp:extent cx="5731510" cy="307340"/>
@@ -3800,6 +3908,9 @@
     </w:p>
     <w:p>
       <w:r>
+        <w:rPr>
+          <w:noProof/>
+        </w:rPr>
         <w:drawing>
           <wp:inline distT="0" distB="0" distL="0" distR="0" wp14:anchorId="5F590150" wp14:editId="30C25C79">
             <wp:extent cx="5731510" cy="881380"/>
@@ -3840,10 +3951,7 @@
     <w:p>
       <w:proofErr w:type="spellStart"/>
       <w:r>
-        <w:t>K</w:t>
-      </w:r>
-      <w:r>
-        <w:t>ubectl</w:t>
+        <w:t>Kubectl</w:t>
       </w:r>
       <w:proofErr w:type="spellEnd"/>
       <w:r>
@@ -3852,6 +3960,9 @@
     </w:p>
     <w:p>
       <w:r>
+        <w:rPr>
+          <w:noProof/>
+        </w:rPr>
         <w:drawing>
           <wp:inline distT="0" distB="0" distL="0" distR="0" wp14:anchorId="7D0B83C3" wp14:editId="287BA560">
             <wp:extent cx="5731510" cy="615950"/>
@@ -3901,6 +4012,10 @@
     </w:p>
     <w:p>
       <w:r>
+        <w:rPr>
+          <w:noProof/>
+        </w:rPr>
+        <w:lastRenderedPageBreak/>
         <w:drawing>
           <wp:inline distT="0" distB="0" distL="0" distR="0" wp14:anchorId="771FC570" wp14:editId="5FCF06D4">
             <wp:extent cx="5731510" cy="893445"/>
@@ -3958,6 +4073,9 @@
     </w:p>
     <w:p>
       <w:r>
+        <w:rPr>
+          <w:noProof/>
+        </w:rPr>
         <w:drawing>
           <wp:inline distT="0" distB="0" distL="0" distR="0" wp14:anchorId="7165A7ED" wp14:editId="00F8FE71">
             <wp:extent cx="5731510" cy="571500"/>
@@ -3997,15 +4115,7 @@
     </w:p>
     <w:p>
       <w:r>
-        <w:t xml:space="preserve">Check below mentioned endpoints, from my system browser, I </w:t>
-      </w:r>
-      <w:proofErr w:type="gramStart"/>
-      <w:r>
-        <w:t>can</w:t>
-      </w:r>
-      <w:proofErr w:type="gramEnd"/>
-      <w:r>
-        <w:t xml:space="preserve"> able to access those endpoints successfully.</w:t>
+        <w:t>Check below mentioned endpoints, from my system browser, I can able to access those endpoints successfully.</w:t>
       </w:r>
     </w:p>
     <w:p>
@@ -4020,6 +4130,9 @@
     </w:p>
     <w:p>
       <w:r>
+        <w:rPr>
+          <w:noProof/>
+        </w:rPr>
         <w:drawing>
           <wp:inline distT="0" distB="0" distL="0" distR="0" wp14:anchorId="01BC5202" wp14:editId="6118B093">
             <wp:extent cx="5731510" cy="1078865"/>
@@ -4059,7 +4172,9 @@
     </w:p>
     <w:p>
       <w:r>
-        <w:lastRenderedPageBreak/>
+        <w:rPr>
+          <w:noProof/>
+        </w:rPr>
         <w:drawing>
           <wp:inline distT="0" distB="0" distL="0" distR="0" wp14:anchorId="6A094E1E" wp14:editId="4756D857">
             <wp:extent cx="5731510" cy="3187700"/>
@@ -4127,6 +4242,7 @@
     </w:p>
     <w:p>
       <w:r>
+        <w:lastRenderedPageBreak/>
         <w:t xml:space="preserve">  -- </w:t>
       </w:r>
       <w:proofErr w:type="spellStart"/>
@@ -4149,6 +4265,9 @@
     <w:p/>
     <w:p>
       <w:r>
+        <w:rPr>
+          <w:noProof/>
+        </w:rPr>
         <w:drawing>
           <wp:inline distT="0" distB="0" distL="0" distR="0" wp14:anchorId="5CFBA7CD" wp14:editId="115E6026">
             <wp:extent cx="5731510" cy="2074545"/>
@@ -4212,7 +4331,9 @@
     <w:p/>
     <w:p>
       <w:r>
-        <w:lastRenderedPageBreak/>
+        <w:rPr>
+          <w:noProof/>
+        </w:rPr>
         <w:drawing>
           <wp:inline distT="0" distB="0" distL="0" distR="0" wp14:anchorId="56854EB7" wp14:editId="607D253F">
             <wp:extent cx="5731510" cy="3140710"/>
@@ -4257,6 +4378,10 @@
     </w:p>
     <w:p>
       <w:r>
+        <w:rPr>
+          <w:noProof/>
+        </w:rPr>
+        <w:lastRenderedPageBreak/>
         <w:drawing>
           <wp:inline distT="0" distB="0" distL="0" distR="0" wp14:anchorId="45E3DFDA" wp14:editId="0EB5BB40">
             <wp:extent cx="5731510" cy="2949575"/>
@@ -4325,6 +4450,9 @@
     </w:p>
     <w:p>
       <w:r>
+        <w:rPr>
+          <w:noProof/>
+        </w:rPr>
         <w:drawing>
           <wp:inline distT="0" distB="0" distL="0" distR="0" wp14:anchorId="1C996143" wp14:editId="3E9670DB">
             <wp:extent cx="5731510" cy="998220"/>
@@ -4365,7 +4493,6 @@
     <w:p/>
     <w:p>
       <w:r>
-        <w:lastRenderedPageBreak/>
         <w:t># Delete</w:t>
       </w:r>
       <w:r>
@@ -4387,6 +4514,9 @@
     </w:p>
     <w:p>
       <w:r>
+        <w:rPr>
+          <w:noProof/>
+        </w:rPr>
         <w:drawing>
           <wp:inline distT="0" distB="0" distL="0" distR="0" wp14:anchorId="2279E6EE" wp14:editId="4B334E16">
             <wp:extent cx="5731510" cy="304800"/>
@@ -4433,6 +4563,10 @@
     <w:p/>
     <w:p>
       <w:r>
+        <w:rPr>
+          <w:noProof/>
+        </w:rPr>
+        <w:lastRenderedPageBreak/>
         <w:drawing>
           <wp:inline distT="0" distB="0" distL="0" distR="0" wp14:anchorId="32FDD00D" wp14:editId="1481C38E">
             <wp:extent cx="5731510" cy="3283585"/>
@@ -4472,6 +4606,9 @@
     </w:p>
     <w:p>
       <w:r>
+        <w:rPr>
+          <w:noProof/>
+        </w:rPr>
         <w:lastRenderedPageBreak/>
         <w:drawing>
           <wp:inline distT="0" distB="0" distL="0" distR="0" wp14:anchorId="63C4C352" wp14:editId="0E861C46">
@@ -4512,6 +4649,9 @@
     </w:p>
     <w:p>
       <w:r>
+        <w:rPr>
+          <w:noProof/>
+        </w:rPr>
         <w:drawing>
           <wp:inline distT="0" distB="0" distL="0" distR="0" wp14:anchorId="5F57F41D" wp14:editId="5883F012">
             <wp:extent cx="5731510" cy="1455420"/>
@@ -4551,6 +4691,9 @@
     </w:p>
     <w:p>
       <w:r>
+        <w:rPr>
+          <w:noProof/>
+        </w:rPr>
         <w:drawing>
           <wp:inline distT="0" distB="0" distL="0" distR="0" wp14:anchorId="07A093DE" wp14:editId="70C50DA7">
             <wp:extent cx="5731510" cy="1244600"/>
@@ -5583,6 +5726,7 @@
   <w:style w:type="character" w:default="1" w:styleId="DefaultParagraphFont">
     <w:name w:val="Default Paragraph Font"/>
     <w:uiPriority w:val="1"/>
+    <w:semiHidden/>
     <w:unhideWhenUsed/>
   </w:style>
   <w:style w:type="table" w:default="1" w:styleId="TableNormal">

</xml_diff>